<commit_message>
Refactor: Add conditional text for player choices
Co-authored-by: jpearleverett <jpearleverett@gmail.com>
</commit_message>
<xml_diff>
--- a/story-revised/CoG - Chapter 6 Scenario C MODIFIED.docx
+++ b/story-revised/CoG - Chapter 6 Scenario C MODIFIED.docx
@@ -551,6 +551,16 @@
     </w:p>
     <w:p>
       <w:r>
+        <w:rPr>
+          <w:i/>
+          <w:color w:val="646464"/>
+          <w:sz w:val="18"/>
+        </w:rPr>
+        <w:t>(Read this if you came via: P2B1-A, P2B2-B, P3B2-A)</w:t>
+      </w:r>
+    </w:p>
+    <w:p>
+      <w:r>
         <w:t>His face had been on every news broadcast for days now, the man who had exposed Commissioner Shaw, the witness who had survived The Whisper's games, the former detective who had become the center of the city's most explosive corruption scandal. The exposure had brought opportunities and dangers in equal measure. People recognized him on the street. Some offered support. Others offered threats. A few had offered money for exclusive interviews, which Kael had declined with varying degrees of politeness.</w:t>
       </w:r>
     </w:p>
@@ -572,6 +582,16 @@
     </w:p>
     <w:p>
       <w:r>
+        <w:rPr>
+          <w:i/>
+          <w:color w:val="646464"/>
+          <w:sz w:val="18"/>
+        </w:rPr>
+        <w:t>(Read this if you came via: P4B2-B, or check your path reference guide above)</w:t>
+      </w:r>
+    </w:p>
+    <w:p>
+      <w:r>
         <w:t>The bullet wound in his shoulder had healed enough to allow movement, but the pain remained, a constant companion that sharpened his focus even as it drained his reserves. The doctors had warned him against strenuous activity. Kael had nodded and ignored them. There were things more important than physical comfort, debts that couldn't wait for bodies to mend.</w:t>
       </w:r>
     </w:p>
@@ -593,6 +613,16 @@
     </w:p>
     <w:p>
       <w:r>
+        <w:rPr>
+          <w:i/>
+          <w:color w:val="646464"/>
+          <w:sz w:val="18"/>
+        </w:rPr>
+        <w:t>(Read this if you came via: P4B2-B, or check your path reference guide above)</w:t>
+      </w:r>
+    </w:p>
+    <w:p>
+      <w:r>
         <w:t>His resources were laughable compared to what he was facing. A handgun with two spare magazines. A phone containing evidence that might or might not survive the night. The clothes on his back and the determination in his heart. No backup, no extraction plan, no cavalry waiting to ride to the rescue.</w:t>
       </w:r>
     </w:p>
@@ -619,6 +649,16 @@
     </w:p>
     <w:p>
       <w:r>
+        <w:rPr>
+          <w:i/>
+          <w:color w:val="646464"/>
+          <w:sz w:val="18"/>
+        </w:rPr>
+        <w:t>(Read this if you came via: ALL PATHS - P2B1-A, P2B2-B, P3A2-B, P3B2-A, P3B2-B, P4A1-B, P4A2-A, P4B2-B)</w:t>
+      </w:r>
+    </w:p>
+    <w:p>
+      <w:r>
         <w:t>The word had become a mantra over the past weeks, repeated in quiet moments until it lost meaning and then found meaning again. Redemption. The possibility that the scales could be balanced, that enough good could outweigh the bad, that a man who had failed so completely could somehow find his way back to something worth being.</w:t>
       </w:r>
     </w:p>
@@ -640,6 +680,16 @@
     </w:p>
     <w:p>
       <w:r>
+        <w:rPr>
+          <w:i/>
+          <w:color w:val="646464"/>
+          <w:sz w:val="18"/>
+        </w:rPr>
+        <w:t>(Read this if you killed an innocent person in an earlier chapter - check your path reference guide above)</w:t>
+      </w:r>
+    </w:p>
+    <w:p>
+      <w:r>
         <w:t>Harold Metz appeared in the corner of the room, his spectral form more solid than it had been in days. The veteran's ghost had been a constant presence since the subway, watching, judging, reminding Kael of the price of his failures. Tonight, Harold seemed almost sympathetic, his hollow eyes holding something that might have been understanding.</w:t>
       </w:r>
     </w:p>
@@ -686,6 +736,16 @@
     </w:p>
     <w:p>
       <w:r>
+        <w:rPr>
+          <w:i/>
+          <w:color w:val="646464"/>
+          <w:sz w:val="18"/>
+        </w:rPr>
+        <w:t>(Read this if you're working with or have worked with DA Cross - check your path reference guide above)</w:t>
+      </w:r>
+    </w:p>
+    <w:p>
+      <w:r>
         <w:t>DA Nathan Cross had called twice in the past hour, his messages increasingly urgent. The official response was mobilizing. Tactical teams were being briefed. The federal government was involved now, marshals and FBI agents adding their weight to the operation. Cross wanted Kael to stay away, to let the professionals handle The Whisper, to preserve himself as a witness for the trials that would follow.</w:t>
       </w:r>
     </w:p>
@@ -707,6 +767,16 @@
     </w:p>
     <w:p>
       <w:r>
+        <w:rPr>
+          <w:i/>
+          <w:color w:val="646464"/>
+          <w:sz w:val="18"/>
+        </w:rPr>
+        <w:t>(Read this if you came via a path where you have no allies - SKIP if you came via P4B2-B)</w:t>
+      </w:r>
+    </w:p>
+    <w:p>
+      <w:r>
         <w:t>The loneliness was the hardest part. Kael had burned so many bridges over the past weeks, pushed away so many potential allies, that he found himself utterly alone at the moment when company would have been most valuable. Torres didn't trust him anymore. Cross saw him as a liability. Miller wanted him dead. Elara saw him as a tool to be used and discarded.</w:t>
       </w:r>
     </w:p>
@@ -755,6 +825,16 @@
     </w:p>
     <w:p>
       <w:r>
+        <w:rPr>
+          <w:i/>
+          <w:color w:val="646464"/>
+          <w:sz w:val="18"/>
+        </w:rPr>
+        <w:t>(Read this if you killed an innocent person in an earlier chapter - check your path reference guide above)</w:t>
+      </w:r>
+    </w:p>
+    <w:p>
+      <w:r>
         <w:t>Harold Metz sat in the passenger seat, his ghostly form occupying space without substance. The veteran stared out the window at the passing darkness, his expression unreadable.</w:t>
       </w:r>
     </w:p>
@@ -857,6 +937,16 @@
     </w:p>
     <w:p>
       <w:r>
+        <w:rPr>
+          <w:i/>
+          <w:color w:val="646464"/>
+          <w:sz w:val="18"/>
+        </w:rPr>
+        <w:t>(Read this if you came via: P4B2-B, or check your path reference guide above)</w:t>
+      </w:r>
+    </w:p>
+    <w:p>
+      <w:r>
         <w:t>The exertion pulled at his injured shoulder, sending waves of pain through his arm and chest. Kael gritted his teeth and kept moving. Pain was information, nothing more. Information that his body was damaged, that he was operating at reduced capacity, that any physical confrontation would put him at a severe disadvantage. Useful information, but not actionable. He couldn't afford to slow down.</w:t>
       </w:r>
     </w:p>
@@ -884,6 +974,16 @@
     </w:p>
     <w:p>
       <w:r>
+        <w:rPr>
+          <w:i/>
+          <w:color w:val="646464"/>
+          <w:sz w:val="18"/>
+        </w:rPr>
+        <w:t>(Read this if you killed an innocent person in an earlier chapter - check your path reference guide above)</w:t>
+      </w:r>
+    </w:p>
+    <w:p>
+      <w:r>
         <w:t>Harold Metz descended beside him, the ghost somehow occupying the narrow space without displacement. The veteran's presence was a comfort Kael hadn't expected, a reminder that he wasn't entirely alone, even if his only companion was dead.</w:t>
       </w:r>
     </w:p>
@@ -936,6 +1036,16 @@
     </w:p>
     <w:p>
       <w:r>
+        <w:rPr>
+          <w:i/>
+          <w:color w:val="646464"/>
+          <w:sz w:val="18"/>
+        </w:rPr>
+        <w:t>(Read this if you came via: P4B2-B, or check your path reference guide above)</w:t>
+      </w:r>
+    </w:p>
+    <w:p>
+      <w:r>
         <w:t>His flashlight was a small tactical model, its beam barely sufficient to illuminate the corridor ahead. Kael used it sparingly, flicking it on to check his path, then off again to preserve his night vision and reduce the chance of detection. The darkness pressed close around him, thick and almost tangible, the kind of darkness that seemed to have weight and substance.</w:t>
       </w:r>
     </w:p>
@@ -957,6 +1067,16 @@
     </w:p>
     <w:p>
       <w:r>
+        <w:rPr>
+          <w:i/>
+          <w:color w:val="646464"/>
+          <w:sz w:val="18"/>
+        </w:rPr>
+        <w:t>(Read this if you came via: ALL PATHS - P2B1-A, P2B2-B, P3A2-B, P3B2-A, P3B2-B, P4A1-B, P4A2-A, P4B2-B)</w:t>
+      </w:r>
+    </w:p>
+    <w:p>
+      <w:r>
         <w:t>The basement felt like purgatory, a transitional space between the world above and something deeper, something darker. Kael had read once that medieval theologians imagined purgatory as a place of cleansing, where souls shed the weight of their sins before ascending to heaven. He wasn't sure he believed in heaven. But he believed in the weight of sins. He felt it every day, pressing down on his shoulders, bending his spine, making every step forward an act of will.</w:t>
       </w:r>
     </w:p>
@@ -989,6 +1109,16 @@
     </w:p>
     <w:p>
       <w:r>
+        <w:rPr>
+          <w:i/>
+          <w:color w:val="646464"/>
+          <w:sz w:val="18"/>
+        </w:rPr>
+        <w:t>(Read this if you came via: P2B1-A, P2B2-B, P3B2-A)</w:t>
+      </w:r>
+    </w:p>
+    <w:p>
+      <w:r>
         <w:t>His face would be recognized if any of The Whisper's operatives spotted him. The coverage had been extensive, his photograph broadcast alongside stories about the corruption scandal, the commissioner's shooting, the man at the center of the city's unraveling. Anonymity was no longer an option. Speed and stealth were his only advantages.</w:t>
       </w:r>
     </w:p>
@@ -1021,6 +1151,16 @@
     </w:p>
     <w:p>
       <w:r>
+        <w:rPr>
+          <w:i/>
+          <w:color w:val="646464"/>
+          <w:sz w:val="18"/>
+        </w:rPr>
+        <w:t>(Read this if you killed an innocent person in an earlier chapter - check your path reference guide above)</w:t>
+      </w:r>
+    </w:p>
+    <w:p>
+      <w:r>
         <w:t>"The people who lived here," Harold said, walking beside Kael through the ruined corridor. "They were the ones society didn't want to think about. The broken ones, the dangerous ones, the ones whose minds worked differently than everyone expected. They locked them away in places like this and pretended they didn't exist."</w:t>
       </w:r>
     </w:p>
@@ -1064,6 +1204,16 @@
     </w:p>
     <w:p>
       <w:r>
+        <w:rPr>
+          <w:i/>
+          <w:color w:val="646464"/>
+          <w:sz w:val="18"/>
+        </w:rPr>
+        <w:t>(Read this if you came via: P4B2-B, or check your path reference guide above)</w:t>
+      </w:r>
+    </w:p>
+    <w:p>
+      <w:r>
         <w:t>The climb was taking its toll. Kael's shoulder screamed with every movement, the pain radiating down his arm and across his chest. He paused on the second floor landing, leaning against the wall, waiting for the worst of the agony to pass. His vision swam. His heart pounded. His body was telling him to stop, to rest, to give up this foolish mission and find somewhere safe to heal.</w:t>
       </w:r>
     </w:p>
@@ -1176,6 +1326,16 @@
     </w:p>
     <w:p>
       <w:r>
+        <w:rPr>
+          <w:i/>
+          <w:color w:val="646464"/>
+          <w:sz w:val="18"/>
+        </w:rPr>
+        <w:t>(Read this if you came via: P4B2-B, or check your path reference guide above)</w:t>
+      </w:r>
+    </w:p>
+    <w:p>
+      <w:r>
         <w:t>Kael was acutely aware of his disadvantages. One pistol against whatever weapons The Whisper had concealed. One man against a killer who had survived two decades of hunting and being hunted. One chance to do something right in a life that had been defined by doing things wrong.</w:t>
       </w:r>
     </w:p>
@@ -1213,6 +1373,16 @@
     </w:p>
     <w:p>
       <w:r>
+        <w:rPr>
+          <w:i/>
+          <w:color w:val="646464"/>
+          <w:sz w:val="18"/>
+        </w:rPr>
+        <w:t>(Read this if you came via: ALL PATHS - P2B1-A, P2B2-B, P3A2-B, P3B2-A, P3B2-B, P4A1-B, P4A2-A, P4B2-B)</w:t>
+      </w:r>
+    </w:p>
+    <w:p>
+      <w:r>
         <w:t>The words came from somewhere deep inside Kael, from the place where he had stored three years of guilt and regret and desperate hope for something better. He wasn't a negotiator. He wasn't trained in hostage situations or crisis intervention. He was just a man who had failed too many times to accept another failure.</w:t>
       </w:r>
     </w:p>
@@ -1249,6 +1419,16 @@
     </w:p>
     <w:p>
       <w:r>
+        <w:rPr>
+          <w:i/>
+          <w:color w:val="646464"/>
+          <w:sz w:val="18"/>
+        </w:rPr>
+        <w:t>(Read this if you killed an innocent person in an earlier chapter - check your path reference guide above)</w:t>
+      </w:r>
+    </w:p>
+    <w:p>
+      <w:r>
         <w:t>Harold Metz stood in the corner of the surgical theater, watching the confrontation with the hollow attention of the dead. The ghost didn't speak, didn't offer advice, simply observed. A witness to whatever would happen next.</w:t>
       </w:r>
     </w:p>
@@ -1280,6 +1460,16 @@
     </w:p>
     <w:p>
       <w:r>
+        <w:rPr>
+          <w:i/>
+          <w:color w:val="646464"/>
+          <w:sz w:val="18"/>
+        </w:rPr>
+        <w:t>(Read this if you came via: P4B2-B, or check your path reference guide above)</w:t>
+      </w:r>
+    </w:p>
+    <w:p>
+      <w:r>
         <w:t>The pain in Kael's shoulder was a distant thing now, pushed to the edges of his awareness by adrenaline and focus. He knew it would return later, would demand attention and rest and probably medical care he couldn't afford. But later was a concept that had lost meaning. There was only now, only this room, only the woman on the table and the man with the blade and the choice that had to be made.</w:t>
       </w:r>
     </w:p>
@@ -1316,6 +1506,16 @@
     </w:p>
     <w:p>
       <w:r>
+        <w:rPr>
+          <w:i/>
+          <w:color w:val="646464"/>
+          <w:sz w:val="18"/>
+        </w:rPr>
+        <w:t>(Read this if you came via: P2B1-A, P2B2-B, P3B2-A)</w:t>
+      </w:r>
+    </w:p>
+    <w:p>
+      <w:r>
         <w:t>"I've seen your interviews," The Whisper said. "The famous whistleblower, the man who exposed Commissioner Shaw. You've become quite the celebrity, Mr. Rourke. Some people are calling you a hero."</w:t>
       </w:r>
     </w:p>
@@ -1388,6 +1588,16 @@
     </w:p>
     <w:p>
       <w:r>
+        <w:rPr>
+          <w:i/>
+          <w:color w:val="646464"/>
+          <w:sz w:val="18"/>
+        </w:rPr>
+        <w:t>(Read this if you have the Ledger evidence - check your path reference guide above)</w:t>
+      </w:r>
+    </w:p>
+    <w:p>
+      <w:r>
         <w:t>"They pinned twenty murders on you, Thomas. We both know you only committed seven. I saw the Ledger. I saw the fake ballistics reports for the Dockside Jane Doe—the rifling match filed two days before the body was found. Thorne and the police killed the other thirteen to hide their dirty work. They turned a grieving father into a serial killer to solve their own problems."</w:t>
       </w:r>
     </w:p>
@@ -1404,6 +1614,16 @@
     </w:p>
     <w:p>
       <w:r>
+        <w:rPr>
+          <w:i/>
+          <w:color w:val="646464"/>
+          <w:sz w:val="18"/>
+        </w:rPr>
+        <w:t>(Read this if you don't have the Ledger evidence - check your path reference guide above)</w:t>
+      </w:r>
+    </w:p>
+    <w:p>
+      <w:r>
         <w:t>"They pinned twenty murders on you, Thomas. But the pattern doesn't fit, does it? Some of those victims had connections to Thorne's business. Some of them knew things they shouldn't have known. You were convenient—a monster they could blame for their own housecleaning."</w:t>
       </w:r>
     </w:p>
@@ -1431,6 +1651,16 @@
     </w:p>
     <w:p>
       <w:r>
+        <w:rPr>
+          <w:i/>
+          <w:color w:val="646464"/>
+          <w:sz w:val="18"/>
+        </w:rPr>
+        <w:t>(Read this if you came via a path where you have no allies - SKIP if you came via P4B2-B)</w:t>
+      </w:r>
+    </w:p>
+    <w:p>
+      <w:r>
         <w:t>Kael was alone in the room with a killer, a hostage, and a choice that would define everything that came after. No backup, no extraction plan, no cavalry waiting to ride to the rescue. Just words, and the hope that words could accomplish what violence had failed to achieve.</w:t>
       </w:r>
     </w:p>
@@ -1448,6 +1678,16 @@
           <w:color w:val="0000C8"/>
         </w:rPr>
         <w:t>[IF DA_ALLY (former):]</w:t>
+      </w:r>
+    </w:p>
+    <w:p>
+      <w:r>
+        <w:rPr>
+          <w:i/>
+          <w:color w:val="646464"/>
+          <w:sz w:val="18"/>
+        </w:rPr>
+        <w:t>(Read this if you're working with or have worked with DA Cross - check your path reference guide above)</w:t>
       </w:r>
     </w:p>
     <w:p>

</xml_diff>

<commit_message>
Refactor: Update scenario C flags and narrative paths
Co-authored-by: jpearleverett <jpearleverett@gmail.com>
</commit_message>
<xml_diff>
--- a/story-revised/CoG - Chapter 6 Scenario C MODIFIED.docx
+++ b/story-revised/CoG - Chapter 6 Scenario C MODIFIED.docx
@@ -106,6 +106,16 @@
     </w:p>
     <w:p>
       <w:r>
+        <w:t xml:space="preserve">  ✅ HAS_LEDGER: YES (retrieved from Delaney's storage unit)</w:t>
+      </w:r>
+    </w:p>
+    <w:p>
+      <w:r>
+        <w:t xml:space="preserve">  ✅ NO_ALLIES: YES (operating alone)</w:t>
+      </w:r>
+    </w:p>
+    <w:p>
+      <w:r>
         <w:t xml:space="preserve">  ❓ WOUNDED: CHECK (depends on earlier choices)</w:t>
       </w:r>
     </w:p>
@@ -116,7 +126,12 @@
     </w:p>
     <w:p>
       <w:r>
-        <w:t xml:space="preserve">  ❓ Other flags: CHECK based on your earlier path</w:t>
+        <w:t xml:space="preserve">  ❓ INNOCENT_BLOOD: CHECK (depends on earlier choices)</w:t>
+      </w:r>
+    </w:p>
+    <w:p>
+      <w:r>
+        <w:t xml:space="preserve">  ❓ DA_ALLY: CHECK (depends on earlier choices)</w:t>
       </w:r>
     </w:p>
     <w:p/>
@@ -145,6 +160,16 @@
     </w:p>
     <w:p>
       <w:r>
+        <w:t xml:space="preserve">  ✅ NO_ALLIES: YES (operating alone)</w:t>
+      </w:r>
+    </w:p>
+    <w:p>
+      <w:r>
+        <w:t xml:space="preserve">  ❌ NO_LEDGER: NO (no Ledger mentioned)</w:t>
+      </w:r>
+    </w:p>
+    <w:p>
+      <w:r>
         <w:t xml:space="preserve">  ❓ WOUNDED: CHECK (depends on earlier choices)</w:t>
       </w:r>
     </w:p>
@@ -155,7 +180,12 @@
     </w:p>
     <w:p>
       <w:r>
-        <w:t xml:space="preserve">  ❓ Other flags: CHECK based on your earlier path</w:t>
+        <w:t xml:space="preserve">  ❓ INNOCENT_BLOOD: CHECK (depends on earlier choices)</w:t>
+      </w:r>
+    </w:p>
+    <w:p>
+      <w:r>
+        <w:t xml:space="preserve">  ❓ DA_ALLY: CHECK (depends on earlier choices)</w:t>
       </w:r>
     </w:p>
     <w:p/>
@@ -179,6 +209,21 @@
     </w:p>
     <w:p>
       <w:r>
+        <w:t xml:space="preserve">  ✅ HAS_LEDGER: YES (photographed Ledger pages)</w:t>
+      </w:r>
+    </w:p>
+    <w:p>
+      <w:r>
+        <w:t xml:space="preserve">  ✅ INNOCENT_BLOOD: YES (Harold Metz mentioned in PREVIOUSLY)</w:t>
+      </w:r>
+    </w:p>
+    <w:p>
+      <w:r>
+        <w:t xml:space="preserve">  ✅ NO_ALLIES: YES (operating alone)</w:t>
+      </w:r>
+    </w:p>
+    <w:p>
+      <w:r>
         <w:t xml:space="preserve">  ❌ EXPOSED/FAMOUS: NO (kept evidence hidden)</w:t>
       </w:r>
     </w:p>
@@ -194,7 +239,7 @@
     </w:p>
     <w:p>
       <w:r>
-        <w:t xml:space="preserve">  ❓ Other flags: CHECK based on your earlier path</w:t>
+        <w:t xml:space="preserve">  ❓ DA_ALLY: CHECK (depends on earlier choices)</w:t>
       </w:r>
     </w:p>
     <w:p/>
@@ -223,17 +268,32 @@
     </w:p>
     <w:p>
       <w:r>
+        <w:t xml:space="preserve">  ✅ HAS_LEDGER: YES (delivered to Cross)</w:t>
+      </w:r>
+    </w:p>
+    <w:p>
+      <w:r>
+        <w:t xml:space="preserve">  ✅ INNOCENT_BLOOD: YES (Harold Metz mentioned in PREVIOUSLY)</w:t>
+      </w:r>
+    </w:p>
+    <w:p>
+      <w:r>
+        <w:t xml:space="preserve">  ✅ DA_ALLY: YES (working with DA Cross)</w:t>
+      </w:r>
+    </w:p>
+    <w:p>
+      <w:r>
+        <w:t xml:space="preserve">  ✅ NO_ALLIES: YES (operating alone)</w:t>
+      </w:r>
+    </w:p>
+    <w:p>
+      <w:r>
         <w:t xml:space="preserve">  ❓ WOUNDED: CHECK (depends on earlier choices)</w:t>
       </w:r>
     </w:p>
     <w:p>
       <w:r>
         <w:t xml:space="preserve">  ❓ LIMITED_RESOURCES: CHECK (depends on earlier choices)</w:t>
-      </w:r>
-    </w:p>
-    <w:p>
-      <w:r>
-        <w:t xml:space="preserve">  ❓ Other flags: CHECK based on your earlier path</w:t>
       </w:r>
     </w:p>
     <w:p/>
@@ -257,6 +317,26 @@
     </w:p>
     <w:p>
       <w:r>
+        <w:t xml:space="preserve">  ✅ HAS_LEDGER: YES (delivered to Cross)</w:t>
+      </w:r>
+    </w:p>
+    <w:p>
+      <w:r>
+        <w:t xml:space="preserve">  ✅ INNOCENT_BLOOD: YES (Harold Metz mentioned in PREVIOUSLY)</w:t>
+      </w:r>
+    </w:p>
+    <w:p>
+      <w:r>
+        <w:t xml:space="preserve">  ✅ DA_ALLY: YES (working with DA Cross)</w:t>
+      </w:r>
+    </w:p>
+    <w:p>
+      <w:r>
+        <w:t xml:space="preserve">  ✅ NO_ALLIES: YES (operating alone)</w:t>
+      </w:r>
+    </w:p>
+    <w:p>
+      <w:r>
         <w:t xml:space="preserve">  ❌ EXPOSED/FAMOUS: NO (worked from shadows)</w:t>
       </w:r>
     </w:p>
@@ -268,11 +348,6 @@
     <w:p>
       <w:r>
         <w:t xml:space="preserve">  ❓ LIMITED_RESOURCES: CHECK (depends on earlier choices)</w:t>
-      </w:r>
-    </w:p>
-    <w:p>
-      <w:r>
-        <w:t xml:space="preserve">  ❓ Other flags: CHECK based on your earlier path</w:t>
       </w:r>
     </w:p>
     <w:p/>
@@ -296,22 +371,37 @@
     </w:p>
     <w:p>
       <w:r>
+        <w:t xml:space="preserve">  ✅ WOUNDED: YES (healing wound mentioned)</w:t>
+      </w:r>
+    </w:p>
+    <w:p>
+      <w:r>
+        <w:t xml:space="preserve">  ✅ HAS_LEDGER: YES (delivered to Elara)</w:t>
+      </w:r>
+    </w:p>
+    <w:p>
+      <w:r>
+        <w:t xml:space="preserve">  ✅ NO_ALLIES: YES (operating alone)</w:t>
+      </w:r>
+    </w:p>
+    <w:p>
+      <w:r>
         <w:t xml:space="preserve">  ❌ EXPOSED/FAMOUS: NO (watched and waited)</w:t>
       </w:r>
     </w:p>
     <w:p>
       <w:r>
-        <w:t xml:space="preserve">  ❓ WOUNDED: CHECK (depends on earlier choices)</w:t>
-      </w:r>
-    </w:p>
-    <w:p>
-      <w:r>
         <w:t xml:space="preserve">  ❓ LIMITED_RESOURCES: CHECK (depends on earlier choices)</w:t>
       </w:r>
     </w:p>
     <w:p>
       <w:r>
-        <w:t xml:space="preserve">  ❓ Other flags: CHECK based on your earlier path</w:t>
+        <w:t xml:space="preserve">  ❓ INNOCENT_BLOOD: CHECK (depends on earlier choices)</w:t>
+      </w:r>
+    </w:p>
+    <w:p>
+      <w:r>
+        <w:t xml:space="preserve">  ❓ DA_ALLY: CHECK (depends on earlier choices)</w:t>
       </w:r>
     </w:p>
     <w:p/>
@@ -335,22 +425,37 @@
     </w:p>
     <w:p>
       <w:r>
+        <w:t xml:space="preserve">  ✅ WOUNDED: YES (healing wound mentioned)</w:t>
+      </w:r>
+    </w:p>
+    <w:p>
+      <w:r>
+        <w:t xml:space="preserve">  ✅ HAS_LEDGER: YES (delivered to Elara)</w:t>
+      </w:r>
+    </w:p>
+    <w:p>
+      <w:r>
+        <w:t xml:space="preserve">  ✅ NO_ALLIES: YES (operating alone)</w:t>
+      </w:r>
+    </w:p>
+    <w:p>
+      <w:r>
         <w:t xml:space="preserve">  ❌ EXPOSED/FAMOUS: NO (questioned Elara privately)</w:t>
       </w:r>
     </w:p>
     <w:p>
       <w:r>
-        <w:t xml:space="preserve">  ❓ WOUNDED: CHECK (depends on earlier choices)</w:t>
-      </w:r>
-    </w:p>
-    <w:p>
-      <w:r>
         <w:t xml:space="preserve">  ❓ LIMITED_RESOURCES: CHECK (depends on earlier choices)</w:t>
       </w:r>
     </w:p>
     <w:p>
       <w:r>
-        <w:t xml:space="preserve">  ❓ Other flags: CHECK based on your earlier path</w:t>
+        <w:t xml:space="preserve">  ❓ INNOCENT_BLOOD: CHECK (depends on earlier choices)</w:t>
+      </w:r>
+    </w:p>
+    <w:p>
+      <w:r>
+        <w:t xml:space="preserve">  ❓ DA_ALLY: CHECK (depends on earlier choices)</w:t>
       </w:r>
     </w:p>
     <w:p/>
@@ -587,7 +692,7 @@
           <w:color w:val="646464"/>
           <w:sz w:val="18"/>
         </w:rPr>
-        <w:t>(Read this if you came via: P4B2-B, or check your path reference guide above)</w:t>
+        <w:t>(Read this if you came via: P4A1-B, P4A2-A, P4B2-B)</w:t>
       </w:r>
     </w:p>
     <w:p>
@@ -618,7 +723,7 @@
           <w:color w:val="646464"/>
           <w:sz w:val="18"/>
         </w:rPr>
-        <w:t>(Read this if you came via: P4B2-B, or check your path reference guide above)</w:t>
+        <w:t>(Read this if you came via: P4B2-B)</w:t>
       </w:r>
     </w:p>
     <w:p>
@@ -685,7 +790,7 @@
           <w:color w:val="646464"/>
           <w:sz w:val="18"/>
         </w:rPr>
-        <w:t>(Read this if you killed an innocent person in an earlier chapter - check your path reference guide above)</w:t>
+        <w:t>(Read this if you came via: P3A2-B, P3B2-A, P3B2-B)</w:t>
       </w:r>
     </w:p>
     <w:p>
@@ -741,7 +846,7 @@
           <w:color w:val="646464"/>
           <w:sz w:val="18"/>
         </w:rPr>
-        <w:t>(Read this if you're working with or have worked with DA Cross - check your path reference guide above)</w:t>
+        <w:t>(Read this if you came via: P3B2-A, P3B2-B)</w:t>
       </w:r>
     </w:p>
     <w:p>
@@ -772,7 +877,7 @@
           <w:color w:val="646464"/>
           <w:sz w:val="18"/>
         </w:rPr>
-        <w:t>(Read this if you came via a path where you have no allies - SKIP if you came via P4B2-B)</w:t>
+        <w:t>(Read this if you came via: P2B1-A, P2B2-B, P3A2-B, P3B2-A, P3B2-B, P4A1-B, P4A2-A - SKIP if you came via P4B2-B)</w:t>
       </w:r>
     </w:p>
     <w:p>
@@ -830,7 +935,7 @@
           <w:color w:val="646464"/>
           <w:sz w:val="18"/>
         </w:rPr>
-        <w:t>(Read this if you killed an innocent person in an earlier chapter - check your path reference guide above)</w:t>
+        <w:t>(Read this if you came via: P3A2-B, P3B2-A, P3B2-B)</w:t>
       </w:r>
     </w:p>
     <w:p>
@@ -942,7 +1047,7 @@
           <w:color w:val="646464"/>
           <w:sz w:val="18"/>
         </w:rPr>
-        <w:t>(Read this if you came via: P4B2-B, or check your path reference guide above)</w:t>
+        <w:t>(Read this if you came via: P4A1-B, P4A2-A, P4B2-B)</w:t>
       </w:r>
     </w:p>
     <w:p>
@@ -1041,7 +1146,7 @@
           <w:color w:val="646464"/>
           <w:sz w:val="18"/>
         </w:rPr>
-        <w:t>(Read this if you came via: P4B2-B, or check your path reference guide above)</w:t>
+        <w:t>(Read this if you came via: P4B2-B)</w:t>
       </w:r>
     </w:p>
     <w:p>
@@ -1156,7 +1261,7 @@
           <w:color w:val="646464"/>
           <w:sz w:val="18"/>
         </w:rPr>
-        <w:t>(Read this if you killed an innocent person in an earlier chapter - check your path reference guide above)</w:t>
+        <w:t>(Read this if you came via: P3A2-B, P3B2-A, P3B2-B)</w:t>
       </w:r>
     </w:p>
     <w:p>
@@ -1209,7 +1314,7 @@
           <w:color w:val="646464"/>
           <w:sz w:val="18"/>
         </w:rPr>
-        <w:t>(Read this if you came via: P4B2-B, or check your path reference guide above)</w:t>
+        <w:t>(Read this if you came via: P4A1-B, P4A2-A, P4B2-B)</w:t>
       </w:r>
     </w:p>
     <w:p>
@@ -1331,7 +1436,7 @@
           <w:color w:val="646464"/>
           <w:sz w:val="18"/>
         </w:rPr>
-        <w:t>(Read this if you came via: P4B2-B, or check your path reference guide above)</w:t>
+        <w:t>(Read this if you came via: P4B2-B)</w:t>
       </w:r>
     </w:p>
     <w:p>
@@ -1424,7 +1529,7 @@
           <w:color w:val="646464"/>
           <w:sz w:val="18"/>
         </w:rPr>
-        <w:t>(Read this if you killed an innocent person in an earlier chapter - check your path reference guide above)</w:t>
+        <w:t>(Read this if you came via: P3A2-B, P3B2-A, P3B2-B)</w:t>
       </w:r>
     </w:p>
     <w:p>
@@ -1465,7 +1570,7 @@
           <w:color w:val="646464"/>
           <w:sz w:val="18"/>
         </w:rPr>
-        <w:t>(Read this if you came via: P4B2-B, or check your path reference guide above)</w:t>
+        <w:t>(Read this if you came via: P4A1-B, P4A2-A, P4B2-B)</w:t>
       </w:r>
     </w:p>
     <w:p>
@@ -1593,7 +1698,7 @@
           <w:color w:val="646464"/>
           <w:sz w:val="18"/>
         </w:rPr>
-        <w:t>(Read this if you have the Ledger evidence - check your path reference guide above)</w:t>
+        <w:t>(Read this if you came via: P2B1-A, P3A2-B, P3B2-A, P3B2-B, P4A1-B, P4A2-A)</w:t>
       </w:r>
     </w:p>
     <w:p>
@@ -1619,7 +1724,7 @@
           <w:color w:val="646464"/>
           <w:sz w:val="18"/>
         </w:rPr>
-        <w:t>(Read this if you don't have the Ledger evidence - check your path reference guide above)</w:t>
+        <w:t>(Read this if you came via: P2B2-B, P4B2-B)</w:t>
       </w:r>
     </w:p>
     <w:p>
@@ -1656,7 +1761,7 @@
           <w:color w:val="646464"/>
           <w:sz w:val="18"/>
         </w:rPr>
-        <w:t>(Read this if you came via a path where you have no allies - SKIP if you came via P4B2-B)</w:t>
+        <w:t>(Read this if you came via: P2B1-A, P2B2-B, P3A2-B, P3B2-A, P3B2-B, P4A1-B, P4A2-A - SKIP if you came via P4B2-B)</w:t>
       </w:r>
     </w:p>
     <w:p>
@@ -1687,7 +1792,7 @@
           <w:color w:val="646464"/>
           <w:sz w:val="18"/>
         </w:rPr>
-        <w:t>(Read this if you're working with or have worked with DA Cross - check your path reference guide above)</w:t>
+        <w:t>(Read this if you came via: P3B2-A, P3B2-B)</w:t>
       </w:r>
     </w:p>
     <w:p>

</xml_diff>